<commit_message>
Update data availability statement in revised manuscript
</commit_message>
<xml_diff>
--- a/revision_2026_10_18/documents/Manuscript_Clean.docx
+++ b/revision_2026_10_18/documents/Manuscript_Clean.docx
@@ -14863,103 +14863,43 @@
           <w:color w:val="000000"/>
           <w:sz w:val="22"/>
         </w:rPr>
-        <w:t xml:space="preserve">Data </w:t>
-      </w:r>
-      <w:r>
-        <w:rPr>
-          <w:rFonts w:ascii="Times New Roman" w:hAnsi="Times New Roman"/>
-          <w:color w:val="000000"/>
-          <w:sz w:val="22"/>
-        </w:rPr>
-        <w:t xml:space="preserve">and code </w:t>
-      </w:r>
-      <w:r>
-        <w:rPr>
-          <w:rFonts w:ascii="Times New Roman" w:hAnsi="Times New Roman"/>
-          <w:color w:val="000000"/>
-          <w:sz w:val="22"/>
-        </w:rPr>
-        <w:t xml:space="preserve">are </w:t>
-      </w:r>
-      <w:r>
-        <w:rPr>
-          <w:rFonts w:ascii="Times New Roman" w:hAnsi="Times New Roman"/>
-          <w:color w:val="000000"/>
-          <w:sz w:val="22"/>
-        </w:rPr>
-        <w:t xml:space="preserve">cited at https://doi.org/10.5281/zenodo.21821042 (Adnan et al., 2026). </w:t>
-      </w:r>
-      <w:r>
-        <w:rPr>
-          <w:rFonts w:ascii="Times New Roman" w:hAnsi="Times New Roman"/>
-          <w:color w:val="000000"/>
-          <w:sz w:val="22"/>
-        </w:rPr>
-        <w:t xml:space="preserve">Elevation-stratified tables require prepared monthly inputs, an aligned elevation grid </w:t>
-      </w:r>
-      <w:r>
-        <w:rPr>
-          <w:rFonts w:ascii="Times New Roman" w:hAnsi="Times New Roman"/>
-          <w:color w:val="000000"/>
-          <w:sz w:val="22"/>
-        </w:rPr>
-        <w:t xml:space="preserve">and </w:t>
-      </w:r>
-      <w:r>
-        <w:rPr>
-          <w:rFonts w:ascii="Times New Roman" w:hAnsi="Times New Roman"/>
-          <w:color w:val="000000"/>
-          <w:sz w:val="22"/>
-        </w:rPr>
-        <w:t xml:space="preserve">configured paths/packages. Raw Landsat, TerraClimate </w:t>
-      </w:r>
-      <w:r>
-        <w:rPr>
-          <w:rFonts w:ascii="Times New Roman" w:hAnsi="Times New Roman"/>
-          <w:color w:val="000000"/>
-          <w:sz w:val="22"/>
-        </w:rPr>
-        <w:t xml:space="preserve">and </w:t>
-      </w:r>
-      <w:r>
-        <w:rPr>
-          <w:rFonts w:ascii="Times New Roman" w:hAnsi="Times New Roman"/>
-          <w:color w:val="000000"/>
-          <w:sz w:val="22"/>
-        </w:rPr>
-        <w:t xml:space="preserve">GOSIF require acquisition/preprocessing (Abatzoglou et al., 2018; Li &amp; Xiao, 2019). Revised </w:t>
-      </w:r>
-      <w:r>
-        <w:rPr>
-          <w:rFonts w:ascii="Times New Roman" w:hAnsi="Times New Roman"/>
-          <w:color w:val="000000"/>
-          <w:sz w:val="22"/>
-        </w:rPr>
-        <w:t xml:space="preserve">scripts, tables and </w:t>
-      </w:r>
-      <w:r>
-        <w:rPr>
-          <w:rFonts w:ascii="Times New Roman" w:hAnsi="Times New Roman"/>
-          <w:color w:val="000000"/>
-          <w:sz w:val="22"/>
-        </w:rPr>
-        <w:t xml:space="preserve">execution instructions </w:t>
-      </w:r>
-      <w:r>
-        <w:rPr>
-          <w:rFonts w:ascii="Times New Roman" w:hAnsi="Times New Roman"/>
-          <w:color w:val="000000"/>
-          <w:sz w:val="22"/>
-        </w:rPr>
-        <w:t xml:space="preserve">will accompany the </w:t>
-      </w:r>
-      <w:r>
-        <w:rPr>
-          <w:rFonts w:ascii="Times New Roman" w:hAnsi="Times New Roman"/>
-          <w:color w:val="000000"/>
-          <w:sz w:val="22"/>
-        </w:rPr>
-        <w:t>updated deposit.</w:t>
+        <w:t xml:space="preserve">Code and derived data from the originally submitted analysis are archived in </w:t>
+      </w:r>
+      <w:hyperlink r:id="rId15">
+        <w:r>
+          <w:rPr>
+            <w:rFonts w:ascii="Times New Roman" w:hAnsi="Times New Roman"/>
+            <w:color w:val="000000"/>
+            <w:sz w:val="22"/>
+          </w:rPr>
+          <w:t xml:space="preserve">Zenodo</w:t>
+        </w:r>
+      </w:hyperlink>
+      <w:r>
+        <w:rPr>
+          <w:rFonts w:ascii="Times New Roman" w:hAnsi="Times New Roman"/>
+          <w:color w:val="000000"/>
+          <w:sz w:val="22"/>
+        </w:rPr>
+        <w:t xml:space="preserve"> (Version v1.0.1; Adnan et al., 2026). Revised scripts, result and diagnostic tables, figures, run metadata and execution instructions for this revision are publicly available in the revision_2026_10_18 folder of the project GitHub repository (</w:t>
+      </w:r>
+      <w:hyperlink r:id="rId22">
+        <w:r>
+          <w:rPr>
+            <w:rFonts w:ascii="Times New Roman" w:hAnsi="Times New Roman"/>
+            <w:color w:val="000000"/>
+            <w:sz w:val="22"/>
+          </w:rPr>
+          <w:t xml:space="preserve">https://github.com/madnankhan336/Compound-Extremes-and-Vegetation-Resilience-Across-Pakistan/tree/main/revision_2026_10_18</w:t>
+        </w:r>
+      </w:hyperlink>
+      <w:r>
+        <w:rPr>
+          <w:rFonts w:ascii="Times New Roman" w:hAnsi="Times New Roman"/>
+          <w:color w:val="000000"/>
+          <w:sz w:val="22"/>
+        </w:rPr>
+        <w:t xml:space="preserve">). Prepared monthly input rasters and per-event output catalogues are not included because of their size. Elevation-stratified tables therefore cannot be reproduced from the scripts alone; they require the prepared monthly inputs, an aligned elevation grid and configured paths and R packages (code/README_Elevation_Table_Reproduction.md). Tables S40 and S41 can be regenerated directly from the included result tables. Raw Landsat Collection 2, TerraClimate and GOSIF products are publicly available from their providers and require acquisition and preprocessing (Abatzoglou et al., 2018; Google Earth Engine, n.d.; Li &amp; Xiao, 2019).</w:t>
       </w:r>
     </w:p>
     <w:p>
@@ -15237,7 +15177,7 @@
             <w:u w:val="single"/>
             <w:lang w:val="it-IT"/>
           </w:rPr>
-          <w:t>https://doi.org/10.5281/zenodo.21821042</w:t>
+          <w:t>https://doi.org/10.5281/zenodo.21821578</w:t>
         </w:r>
       </w:hyperlink>
     </w:p>

</xml_diff>

<commit_message>
Cite Zenodo v1.1.0 in revised manuscript and README
</commit_message>
<xml_diff>
--- a/revision_2026_10_18/documents/Manuscript_Clean.docx
+++ b/revision_2026_10_18/documents/Manuscript_Clean.docx
@@ -14863,7 +14863,7 @@
           <w:color w:val="000000"/>
           <w:sz w:val="22"/>
         </w:rPr>
-        <w:t xml:space="preserve">Code and derived data from the originally submitted analysis are archived in </w:t>
+        <w:t xml:space="preserve">Code and derived data are archived in </w:t>
       </w:r>
       <w:hyperlink r:id="rId15">
         <w:r>
@@ -14881,7 +14881,7 @@
           <w:color w:val="000000"/>
           <w:sz w:val="22"/>
         </w:rPr>
-        <w:t xml:space="preserve"> (Version v1.0.1; Adnan et al., 2026). Revised scripts, result and diagnostic tables, figures, run metadata and execution instructions for this revision are publicly available in the revision_2026_10_18 folder of the project GitHub repository (</w:t>
+        <w:t xml:space="preserve"> (Version v1.1.0; Adnan et al., 2026); this version retains the originally submitted v1.0.1 files and adds the revised scripts, result and diagnostic tables, figures, run metadata and execution instructions. The revised files are also available in the revision_2026_10_18 folder of the project GitHub repository (</w:t>
       </w:r>
       <w:hyperlink r:id="rId22">
         <w:r>
@@ -15162,7 +15162,7 @@
       <w:proofErr w:type="spellEnd"/>
       <w:r>
         <w:rPr/>
-        <w:t xml:space="preserve">, M., Shahzad, F., Du, Z., &amp; Yue, T. (2026). Compound-Extremes-and-Vegetation-Resilience-Across-Pakistan: Data and code for compound heat–drought extremes and vegetation response across Pakistan (1985–2025) (Version v1.0.1) [Software and data set]. </w:t>
+        <w:t xml:space="preserve">, M., Shahzad, F., Du, Z., &amp; Yue, T. (2026). Compound-Extremes-and-Vegetation-Resilience-Across-Pakistan: Revised data and code for compound heat–drought extremes and vegetation response across Pakistan (1985–2025) (Version v1.1.0) [Software and data set]. </w:t>
       </w:r>
       <w:r>
         <w:rPr>
@@ -15177,7 +15177,7 @@
             <w:u w:val="single"/>
             <w:lang w:val="it-IT"/>
           </w:rPr>
-          <w:t>https://doi.org/10.5281/zenodo.21821578</w:t>
+          <w:t>https://doi.org/10.5281/zenodo.23453248</w:t>
         </w:r>
       </w:hyperlink>
     </w:p>

</xml_diff>

<commit_message>
Name Copernicus GLO-30 elevation source
</commit_message>
<xml_diff>
--- a/revision_2026_10_18/documents/Manuscript_Clean.docx
+++ b/revision_2026_10_18/documents/Manuscript_Clean.docx
@@ -2624,7 +2624,14 @@
       </w:r>
       <w:proofErr w:type="spellEnd"/>
       <w:r>
-        <w:t xml:space="preserve"> pressure deficit, soil moisture, potential and actual evapotranspiration, and climatic water balance served as covariates for interpretation and modelling; scale factors and unit conventions were applied so that all predictors were in physical units, and continuous fields were resampled bilinearly. A static elevation layer supported regime stratification and represented topographic control. The datasets, with their sources, resolutions, and uses, are </w:t>
+        <w:t xml:space="preserve"> pressure deficit, soil moisture, potential and actual evapotranspiration, and climatic water balance served as covariates for interpretation and modelling; scale factors and unit conventions were applied so that all predictors were in physical units, and continuous fields were resampled bilinearly. </w:t>
+      </w:r>
+      <w:r>
+        <w:rPr/>
+        <w:t xml:space="preserve">Elevation from the Copernicus GLO-30 Digital Elevation Model (30 m; European Space Agency &amp; Airbus Defence and Space, n.d.), accessed through Google Earth Engine and resampled to the analysis grid, supported regime stratification and represented topographic control.</w:t>
+      </w:r>
+      <w:r>
+        <w:t xml:space="preserve"> The datasets, with their sources, resolutions, and uses, are </w:t>
       </w:r>
       <w:proofErr w:type="spellStart"/>
       <w:r>
@@ -3435,7 +3442,7 @@
                 <w:szCs w:val="20"/>
                 <w14:ligatures w14:val="none"/>
               </w:rPr>
-              <w:t>Elevation raster (analysis grid)</w:t>
+              <w:t>Copernicus GLO-30 DEM via Google Earth Engine (European Space Agency &amp; Airbus Defence and Space, n.d.)</w:t>
             </w:r>
           </w:p>
         </w:tc>
@@ -3553,7 +3560,7 @@
                 <w:szCs w:val="20"/>
                 <w14:ligatures w14:val="none"/>
               </w:rPr>
-              <w:t>analysis grid</w:t>
+              <w:t>30 m native (resampled to analysis grid)</w:t>
             </w:r>
           </w:p>
         </w:tc>
@@ -15896,6 +15903,31 @@
         </w:rPr>
         <w:t>European Space Agency. (n.d.). Land Cover: ESA Climate Change Initiative. https://climate.esa.int/en/projects/land-cover/</w:t>
       </w:r>
+    </w:p>
+    <w:p>
+      <w:pPr>
+        <w:keepNext w:val="0"/>
+        <w:keepLines/>
+        <w:autoSpaceDE w:val="0"/>
+        <w:autoSpaceDN w:val="0"/>
+        <w:spacing w:after="120" w:line="360" w:lineRule="auto"/>
+        <w:ind w:left="403" w:hanging="403"/>
+        <w:divId w:val="480736841"/>
+      </w:pPr>
+      <w:r>
+        <w:rPr>
+          <w:i w:val="0"/>
+        </w:rPr>
+        <w:t xml:space="preserve">European Space Agency &amp; Airbus Defence and Space. (n.d.). Copernicus DEM GLO-30: Global 30 m digital elevation model [Data set]. Accessed through Google Earth Engine. </w:t>
+      </w:r>
+      <w:hyperlink r:id="rId23">
+        <w:r>
+          <w:rPr>
+            <w:i w:val="0"/>
+          </w:rPr>
+          <w:t xml:space="preserve">https://doi.org/10.5270/ESA-c5d3d65</w:t>
+        </w:r>
+      </w:hyperlink>
     </w:p>
     <w:p>
       <w:pPr>

</xml_diff>

<commit_message>
Update sensor and compositing limitations and heading format
</commit_message>
<xml_diff>
--- a/revision_2026_10_18/documents/Manuscript_Clean.docx
+++ b/revision_2026_10_18/documents/Manuscript_Clean.docx
@@ -285,14 +285,25 @@
     <w:p>
       <w:pPr>
         <w:pStyle w:val="Heading1"/>
-        <w:spacing w:before="0" w:after="0" w:line="360" w:lineRule="auto"/>
-        <w:rPr>
-          <w:color w:val="auto"/>
-        </w:rPr>
-      </w:pPr>
-      <w:r>
-        <w:rPr>
-          <w:rFonts w:eastAsia="Times New Roman" w:cs="Times New Roman"/>
+        <w:spacing w:before="120" w:after="60" w:line="360" w:lineRule="auto"/>
+        <w:jc w:val="left"/>
+        <w:rPr>
+          <w:rFonts w:ascii="Times New Roman" w:hAnsi="Times New Roman" w:eastAsia="Times New Roman" w:cs="Times New Roman"/>
+          <w:b/>
+          <w:bCs/>
+          <w:color w:val="000000"/>
+          <w:sz w:val="24"/>
+          <w:szCs w:val="24"/>
+        </w:rPr>
+      </w:pPr>
+      <w:r>
+        <w:rPr>
+          <w:rFonts w:ascii="Times New Roman" w:hAnsi="Times New Roman" w:eastAsia="Times New Roman" w:cs="Times New Roman"/>
+          <w:b/>
+          <w:bCs/>
+          <w:color w:val="000000"/>
+          <w:sz w:val="24"/>
+          <w:szCs w:val="24"/>
         </w:rPr>
         <w:lastRenderedPageBreak/>
         <w:t>Abstract</w:t>
@@ -720,24 +731,40 @@
     <w:p>
       <w:pPr>
         <w:pStyle w:val="Heading1"/>
-        <w:spacing w:before="0" w:after="0" w:line="360" w:lineRule="auto"/>
-      </w:pPr>
-      <w:r>
-        <w:rPr>
-          <w:rFonts w:eastAsia="Times New Roman" w:cs="Times New Roman"/>
+        <w:spacing w:before="120" w:after="60" w:line="360" w:lineRule="auto"/>
+        <w:jc w:val="left"/>
+      </w:pPr>
+      <w:r>
+        <w:rPr>
+          <w:rFonts w:ascii="Times New Roman" w:hAnsi="Times New Roman" w:eastAsia="Times New Roman" w:cs="Times New Roman"/>
+          <w:b/>
+          <w:bCs/>
+          <w:color w:val="000000"/>
+          <w:sz w:val="24"/>
+          <w:szCs w:val="24"/>
         </w:rPr>
         <w:lastRenderedPageBreak/>
         <w:t>1</w:t>
       </w:r>
       <w:r>
         <w:rPr>
-          <w:rFonts w:eastAsia="Times New Roman" w:cs="Times New Roman"/>
+          <w:rFonts w:ascii="Times New Roman" w:hAnsi="Times New Roman" w:eastAsia="Times New Roman" w:cs="Times New Roman"/>
+          <w:b/>
+          <w:bCs/>
+          <w:color w:val="000000"/>
+          <w:sz w:val="24"/>
+          <w:szCs w:val="24"/>
         </w:rPr>
         <w:t>.</w:t>
       </w:r>
       <w:r>
         <w:rPr>
-          <w:rFonts w:eastAsia="Times New Roman" w:cs="Times New Roman"/>
+          <w:rFonts w:ascii="Times New Roman" w:hAnsi="Times New Roman" w:eastAsia="Times New Roman" w:cs="Times New Roman"/>
+          <w:b/>
+          <w:bCs/>
+          <w:color w:val="000000"/>
+          <w:sz w:val="24"/>
+          <w:szCs w:val="24"/>
         </w:rPr>
         <w:t xml:space="preserve"> Introduction</w:t>
       </w:r>
@@ -1226,11 +1253,17 @@
     <w:p>
       <w:pPr>
         <w:pStyle w:val="Heading1"/>
-        <w:spacing w:before="0" w:after="0" w:line="360" w:lineRule="auto"/>
-      </w:pPr>
-      <w:r>
-        <w:rPr>
-          <w:rFonts w:eastAsia="Times New Roman" w:cs="Times New Roman"/>
+        <w:spacing w:before="120" w:after="60" w:line="360" w:lineRule="auto"/>
+        <w:jc w:val="left"/>
+      </w:pPr>
+      <w:r>
+        <w:rPr>
+          <w:rFonts w:ascii="Times New Roman" w:hAnsi="Times New Roman" w:eastAsia="Times New Roman" w:cs="Times New Roman"/>
+          <w:b/>
+          <w:bCs/>
+          <w:color w:val="000000"/>
+          <w:sz w:val="24"/>
+          <w:szCs w:val="24"/>
         </w:rPr>
         <w:t>2. Methodology</w:t>
       </w:r>
@@ -1238,19 +1271,23 @@
     <w:p>
       <w:pPr>
         <w:pStyle w:val="Heading2"/>
-        <w:spacing w:before="0" w:after="0" w:line="360" w:lineRule="auto"/>
-        <w:rPr>
+        <w:spacing w:before="120" w:after="60" w:line="360" w:lineRule="auto"/>
+        <w:jc w:val="left"/>
+        <w:rPr>
+          <w:rFonts w:ascii="Times New Roman" w:hAnsi="Times New Roman" w:eastAsia="Times New Roman" w:cs="Times New Roman"/>
           <w:b/>
           <w:bCs/>
+          <w:color w:val="000000"/>
           <w:sz w:val="24"/>
           <w:szCs w:val="24"/>
         </w:rPr>
       </w:pPr>
       <w:r>
         <w:rPr>
-          <w:rFonts w:ascii="Times New Roman" w:eastAsia="Times New Roman" w:hAnsi="Times New Roman" w:cs="Times New Roman"/>
+          <w:rFonts w:ascii="Times New Roman" w:hAnsi="Times New Roman" w:eastAsia="Times New Roman" w:cs="Times New Roman"/>
           <w:b/>
           <w:bCs/>
+          <w:color w:val="000000"/>
           <w:sz w:val="24"/>
           <w:szCs w:val="24"/>
         </w:rPr>
@@ -1546,19 +1583,23 @@
     <w:p>
       <w:pPr>
         <w:pStyle w:val="Heading2"/>
-        <w:spacing w:before="0" w:after="0" w:line="360" w:lineRule="auto"/>
-        <w:rPr>
+        <w:spacing w:before="120" w:after="60" w:line="360" w:lineRule="auto"/>
+        <w:jc w:val="left"/>
+        <w:rPr>
+          <w:rFonts w:ascii="Times New Roman" w:hAnsi="Times New Roman" w:eastAsia="Times New Roman" w:cs="Times New Roman"/>
           <w:b/>
           <w:bCs/>
+          <w:color w:val="000000"/>
           <w:sz w:val="24"/>
           <w:szCs w:val="24"/>
         </w:rPr>
       </w:pPr>
       <w:r>
         <w:rPr>
-          <w:rFonts w:ascii="Times New Roman" w:eastAsia="Times New Roman" w:hAnsi="Times New Roman" w:cs="Times New Roman"/>
+          <w:rFonts w:ascii="Times New Roman" w:hAnsi="Times New Roman" w:eastAsia="Times New Roman" w:cs="Times New Roman"/>
           <w:b/>
           <w:bCs/>
+          <w:color w:val="000000"/>
           <w:sz w:val="24"/>
           <w:szCs w:val="24"/>
         </w:rPr>
@@ -1930,11 +1971,17 @@
     <w:p>
       <w:pPr>
         <w:pStyle w:val="Heading3"/>
-        <w:spacing w:before="0" w:after="0" w:line="360" w:lineRule="auto"/>
-      </w:pPr>
-      <w:r>
-        <w:rPr>
-          <w:rFonts w:eastAsia="Times New Roman" w:cs="Times New Roman"/>
+        <w:spacing w:before="120" w:after="60" w:line="360" w:lineRule="auto"/>
+        <w:jc w:val="left"/>
+      </w:pPr>
+      <w:r>
+        <w:rPr>
+          <w:rFonts w:ascii="Times New Roman" w:hAnsi="Times New Roman" w:eastAsia="Times New Roman" w:cs="Times New Roman"/>
+          <w:b/>
+          <w:bCs/>
+          <w:color w:val="000000"/>
+          <w:sz w:val="24"/>
+          <w:szCs w:val="24"/>
         </w:rPr>
         <w:t>2.2.1 Monthly compositing and handling of missing months</w:t>
       </w:r>
@@ -2255,26 +2302,26 @@
     <w:p>
       <w:pPr>
         <w:pStyle w:val="Heading3"/>
-        <w:spacing w:after="0" w:line="360" w:lineRule="auto"/>
+        <w:spacing w:before="120" w:after="60" w:line="360" w:lineRule="auto"/>
         <w:jc w:val="left"/>
         <w:rPr>
-          <w:rFonts w:eastAsia="Times New Roman" w:cs="Times New Roman"/>
+          <w:rFonts w:ascii="Times New Roman" w:hAnsi="Times New Roman" w:eastAsia="Times New Roman" w:cs="Times New Roman"/>
           <w:b/>
           <w:bCs/>
-          <w:kern w:val="0"/>
-          <w:sz w:val="27"/>
-          <w:szCs w:val="27"/>
+          <w:color w:val="000000"/>
+          <w:sz w:val="24"/>
+          <w:szCs w:val="24"/>
           <w14:ligatures w14:val="none"/>
         </w:rPr>
       </w:pPr>
       <w:r>
         <w:rPr>
-          <w:rFonts w:eastAsia="Times New Roman" w:cs="Times New Roman"/>
+          <w:rFonts w:ascii="Times New Roman" w:hAnsi="Times New Roman" w:eastAsia="Times New Roman" w:cs="Times New Roman"/>
           <w:b/>
           <w:bCs/>
-          <w:kern w:val="0"/>
-          <w:sz w:val="27"/>
-          <w:szCs w:val="27"/>
+          <w:color w:val="000000"/>
+          <w:sz w:val="24"/>
+          <w:szCs w:val="24"/>
           <w14:ligatures w14:val="none"/>
         </w:rPr>
         <w:lastRenderedPageBreak/>
@@ -2283,12 +2330,12 @@
       <w:proofErr w:type="spellStart"/>
       <w:r>
         <w:rPr>
-          <w:rFonts w:eastAsia="Times New Roman" w:cs="Times New Roman"/>
+          <w:rFonts w:ascii="Times New Roman" w:hAnsi="Times New Roman" w:eastAsia="Times New Roman" w:cs="Times New Roman"/>
           <w:b/>
           <w:bCs/>
-          <w:kern w:val="0"/>
-          <w:sz w:val="27"/>
-          <w:szCs w:val="27"/>
+          <w:color w:val="000000"/>
+          <w:sz w:val="24"/>
+          <w:szCs w:val="24"/>
           <w14:ligatures w14:val="none"/>
         </w:rPr>
         <w:t>harmonisation</w:t>
@@ -2296,12 +2343,12 @@
       <w:proofErr w:type="spellEnd"/>
       <w:r>
         <w:rPr>
-          <w:rFonts w:eastAsia="Times New Roman" w:cs="Times New Roman"/>
+          <w:rFonts w:ascii="Times New Roman" w:hAnsi="Times New Roman" w:eastAsia="Times New Roman" w:cs="Times New Roman"/>
           <w:b/>
           <w:bCs/>
-          <w:kern w:val="0"/>
-          <w:sz w:val="27"/>
-          <w:szCs w:val="27"/>
+          <w:color w:val="000000"/>
+          <w:sz w:val="24"/>
+          <w:szCs w:val="24"/>
           <w14:ligatures w14:val="none"/>
         </w:rPr>
         <w:t xml:space="preserve"> and anomaly </w:t>
@@ -2309,12 +2356,12 @@
       <w:proofErr w:type="spellStart"/>
       <w:r>
         <w:rPr>
-          <w:rFonts w:eastAsia="Times New Roman" w:cs="Times New Roman"/>
+          <w:rFonts w:ascii="Times New Roman" w:hAnsi="Times New Roman" w:eastAsia="Times New Roman" w:cs="Times New Roman"/>
           <w:b/>
           <w:bCs/>
-          <w:kern w:val="0"/>
-          <w:sz w:val="27"/>
-          <w:szCs w:val="27"/>
+          <w:color w:val="000000"/>
+          <w:sz w:val="24"/>
+          <w:szCs w:val="24"/>
           <w14:ligatures w14:val="none"/>
         </w:rPr>
         <w:t>standardisation</w:t>
@@ -3646,23 +3693,26 @@
       <w:pPr>
         <w:pStyle w:val="Heading2"/>
         <w:keepNext/>
-        <w:spacing w:after="0" w:line="360" w:lineRule="auto"/>
-        <w:rPr>
-          <w:rFonts w:eastAsia="Times New Roman" w:cs="Times New Roman"/>
+        <w:spacing w:before="120" w:after="60" w:line="360" w:lineRule="auto"/>
+        <w:jc w:val="left"/>
+        <w:rPr>
+          <w:rFonts w:ascii="Times New Roman" w:hAnsi="Times New Roman" w:eastAsia="Times New Roman" w:cs="Times New Roman"/>
           <w:b/>
           <w:bCs/>
-          <w:kern w:val="0"/>
-          <w:sz w:val="27"/>
-          <w:szCs w:val="27"/>
+          <w:color w:val="000000"/>
+          <w:sz w:val="24"/>
+          <w:szCs w:val="24"/>
           <w14:ligatures w14:val="none"/>
         </w:rPr>
       </w:pPr>
       <w:r>
         <w:rPr>
-          <w:rFonts w:ascii="Times New Roman" w:hAnsi="Times New Roman"/>
+          <w:rFonts w:ascii="Times New Roman" w:hAnsi="Times New Roman" w:eastAsia="Times New Roman" w:cs="Times New Roman"/>
           <w:b/>
+          <w:bCs/>
           <w:color w:val="000000"/>
           <w:sz w:val="24"/>
+          <w:szCs w:val="24"/>
         </w:rPr>
         <w:t>2.3 Event definitions, response lags, censored recovery and descriptive contrasts</w:t>
       </w:r>
@@ -5826,22 +5876,24 @@
     <w:p>
       <w:pPr>
         <w:pStyle w:val="Heading2"/>
-        <w:spacing w:after="0" w:line="360" w:lineRule="auto"/>
-        <w:rPr>
-          <w:rFonts w:eastAsia="Times New Roman" w:cs="Times New Roman"/>
+        <w:spacing w:before="120" w:after="60" w:line="360" w:lineRule="auto"/>
+        <w:jc w:val="left"/>
+        <w:rPr>
+          <w:rFonts w:ascii="Times New Roman" w:hAnsi="Times New Roman" w:eastAsia="Times New Roman" w:cs="Times New Roman"/>
           <w:b/>
           <w:bCs/>
-          <w:kern w:val="0"/>
-          <w:sz w:val="22"/>
-          <w:szCs w:val="22"/>
+          <w:color w:val="000000"/>
+          <w:sz w:val="24"/>
+          <w:szCs w:val="24"/>
           <w14:ligatures w14:val="none"/>
         </w:rPr>
       </w:pPr>
       <w:r>
         <w:rPr>
-          <w:rFonts w:ascii="Times New Roman" w:eastAsia="Times New Roman" w:hAnsi="Times New Roman" w:cs="Times New Roman"/>
+          <w:rFonts w:ascii="Times New Roman" w:hAnsi="Times New Roman" w:eastAsia="Times New Roman" w:cs="Times New Roman"/>
           <w:b/>
           <w:bCs/>
+          <w:color w:val="000000"/>
           <w:sz w:val="24"/>
           <w:szCs w:val="24"/>
         </w:rPr>
@@ -7063,21 +7115,25 @@
       <w:pPr>
         <w:pStyle w:val="Heading2"/>
         <w:keepNext/>
-        <w:spacing w:before="0" w:after="0" w:line="360" w:lineRule="auto"/>
-        <w:rPr>
-          <w:rFonts w:ascii="Times New Roman" w:hAnsi="Times New Roman" w:cs="Times New Roman"/>
+        <w:spacing w:before="120" w:after="60" w:line="360" w:lineRule="auto"/>
+        <w:jc w:val="left"/>
+        <w:rPr>
+          <w:rFonts w:ascii="Times New Roman" w:hAnsi="Times New Roman" w:eastAsia="Times New Roman" w:cs="Times New Roman"/>
           <w:b/>
           <w:bCs/>
+          <w:color w:val="000000"/>
           <w:sz w:val="24"/>
           <w:szCs w:val="24"/>
         </w:rPr>
       </w:pPr>
       <w:r>
         <w:rPr>
-          <w:rFonts w:ascii="Times New Roman" w:hAnsi="Times New Roman"/>
+          <w:rFonts w:ascii="Times New Roman" w:hAnsi="Times New Roman" w:eastAsia="Times New Roman" w:cs="Times New Roman"/>
           <w:b/>
+          <w:bCs/>
           <w:color w:val="000000"/>
           <w:sz w:val="24"/>
+          <w:szCs w:val="24"/>
         </w:rPr>
         <w:t>2.5 Primary framework and sensitivity analyses</w:t>
       </w:r>
@@ -7135,25 +7191,26 @@
     <w:p>
       <w:pPr>
         <w:pStyle w:val="Heading3"/>
-        <w:spacing w:after="0" w:line="360" w:lineRule="auto"/>
-        <w:rPr>
-          <w:rFonts w:eastAsia="Times New Roman" w:cs="Times New Roman"/>
+        <w:spacing w:before="120" w:after="60" w:line="360" w:lineRule="auto"/>
+        <w:jc w:val="left"/>
+        <w:rPr>
+          <w:rFonts w:ascii="Times New Roman" w:hAnsi="Times New Roman" w:eastAsia="Times New Roman" w:cs="Times New Roman"/>
           <w:b/>
           <w:bCs/>
-          <w:kern w:val="0"/>
-          <w:sz w:val="27"/>
-          <w:szCs w:val="27"/>
+          <w:color w:val="000000"/>
+          <w:sz w:val="24"/>
+          <w:szCs w:val="24"/>
           <w14:ligatures w14:val="none"/>
         </w:rPr>
       </w:pPr>
       <w:r>
         <w:rPr>
-          <w:rFonts w:eastAsia="Times New Roman" w:cs="Times New Roman"/>
+          <w:rFonts w:ascii="Times New Roman" w:hAnsi="Times New Roman" w:eastAsia="Times New Roman" w:cs="Times New Roman"/>
           <w:b/>
           <w:bCs/>
-          <w:kern w:val="0"/>
-          <w:sz w:val="27"/>
-          <w:szCs w:val="27"/>
+          <w:color w:val="000000"/>
+          <w:sz w:val="24"/>
+          <w:szCs w:val="24"/>
           <w14:ligatures w14:val="none"/>
         </w:rPr>
         <w:t>2.5.1 Sensitivity to hot and dry threshold choices</w:t>
@@ -7778,11 +7835,17 @@
     <w:p>
       <w:pPr>
         <w:pStyle w:val="Heading3"/>
-        <w:spacing w:before="0" w:after="0" w:line="360" w:lineRule="auto"/>
-      </w:pPr>
-      <w:r>
-        <w:rPr>
-          <w:rFonts w:eastAsia="Times New Roman" w:cs="Times New Roman"/>
+        <w:spacing w:before="120" w:after="60" w:line="360" w:lineRule="auto"/>
+        <w:jc w:val="left"/>
+      </w:pPr>
+      <w:r>
+        <w:rPr>
+          <w:rFonts w:ascii="Times New Roman" w:hAnsi="Times New Roman" w:eastAsia="Times New Roman" w:cs="Times New Roman"/>
+          <w:b/>
+          <w:bCs/>
+          <w:color w:val="000000"/>
+          <w:sz w:val="24"/>
+          <w:szCs w:val="24"/>
         </w:rPr>
         <w:t>2.5.2 Sensitivity to the choice of moisture limitation proxy</w:t>
       </w:r>
@@ -8392,11 +8455,17 @@
     <w:p>
       <w:pPr>
         <w:pStyle w:val="Heading3"/>
-        <w:spacing w:before="0" w:after="0" w:line="360" w:lineRule="auto"/>
-      </w:pPr>
-      <w:r>
-        <w:rPr>
-          <w:rFonts w:eastAsia="Times New Roman" w:cs="Times New Roman"/>
+        <w:spacing w:before="120" w:after="60" w:line="360" w:lineRule="auto"/>
+        <w:jc w:val="left"/>
+      </w:pPr>
+      <w:r>
+        <w:rPr>
+          <w:rFonts w:ascii="Times New Roman" w:hAnsi="Times New Roman" w:eastAsia="Times New Roman" w:cs="Times New Roman"/>
+          <w:b/>
+          <w:bCs/>
+          <w:color w:val="000000"/>
+          <w:sz w:val="24"/>
+          <w:szCs w:val="24"/>
         </w:rPr>
         <w:t>2.5.3 Pixel-wise event metrics and response stability</w:t>
       </w:r>
@@ -8678,18 +8747,23 @@
     <w:p>
       <w:pPr>
         <w:pStyle w:val="Heading2"/>
-        <w:rPr>
+        <w:spacing w:before="120" w:after="60" w:line="360" w:lineRule="auto"/>
+        <w:jc w:val="left"/>
+        <w:rPr>
+          <w:rFonts w:ascii="Times New Roman" w:hAnsi="Times New Roman" w:eastAsia="Times New Roman" w:cs="Times New Roman"/>
           <w:b/>
           <w:bCs/>
+          <w:color w:val="000000"/>
           <w:sz w:val="24"/>
           <w:szCs w:val="24"/>
         </w:rPr>
       </w:pPr>
       <w:r>
         <w:rPr>
-          <w:rFonts w:ascii="Times New Roman" w:eastAsia="Times New Roman" w:hAnsi="Times New Roman" w:cs="Times New Roman"/>
+          <w:rFonts w:ascii="Times New Roman" w:hAnsi="Times New Roman" w:eastAsia="Times New Roman" w:cs="Times New Roman"/>
           <w:b/>
           <w:bCs/>
+          <w:color w:val="000000"/>
           <w:sz w:val="24"/>
           <w:szCs w:val="24"/>
         </w:rPr>
@@ -9399,11 +9473,17 @@
     <w:p>
       <w:pPr>
         <w:pStyle w:val="Heading1"/>
-        <w:spacing w:before="0" w:after="0" w:line="360" w:lineRule="auto"/>
-      </w:pPr>
-      <w:r>
-        <w:rPr>
-          <w:rFonts w:eastAsia="Times New Roman" w:cs="Times New Roman"/>
+        <w:spacing w:before="120" w:after="60" w:line="360" w:lineRule="auto"/>
+        <w:jc w:val="left"/>
+      </w:pPr>
+      <w:r>
+        <w:rPr>
+          <w:rFonts w:ascii="Times New Roman" w:hAnsi="Times New Roman" w:eastAsia="Times New Roman" w:cs="Times New Roman"/>
+          <w:b/>
+          <w:bCs/>
+          <w:color w:val="000000"/>
+          <w:sz w:val="24"/>
+          <w:szCs w:val="24"/>
         </w:rPr>
         <w:t>3. Results</w:t>
       </w:r>
@@ -9411,19 +9491,23 @@
     <w:p>
       <w:pPr>
         <w:pStyle w:val="Heading2"/>
-        <w:spacing w:before="0" w:after="0" w:line="360" w:lineRule="auto"/>
-        <w:rPr>
+        <w:spacing w:before="120" w:after="60" w:line="360" w:lineRule="auto"/>
+        <w:jc w:val="left"/>
+        <w:rPr>
+          <w:rFonts w:ascii="Times New Roman" w:hAnsi="Times New Roman" w:eastAsia="Times New Roman" w:cs="Times New Roman"/>
           <w:b/>
           <w:bCs/>
+          <w:color w:val="000000"/>
           <w:sz w:val="24"/>
           <w:szCs w:val="24"/>
         </w:rPr>
       </w:pPr>
       <w:r>
         <w:rPr>
-          <w:rFonts w:ascii="Times New Roman" w:eastAsia="Times New Roman" w:hAnsi="Times New Roman" w:cs="Times New Roman"/>
+          <w:rFonts w:ascii="Times New Roman" w:hAnsi="Times New Roman" w:eastAsia="Times New Roman" w:cs="Times New Roman"/>
           <w:b/>
           <w:bCs/>
+          <w:color w:val="000000"/>
           <w:sz w:val="24"/>
           <w:szCs w:val="24"/>
         </w:rPr>
@@ -9813,19 +9897,23 @@
     <w:p>
       <w:pPr>
         <w:pStyle w:val="Heading2"/>
-        <w:spacing w:before="240" w:after="0" w:line="360" w:lineRule="auto"/>
-        <w:rPr>
+        <w:spacing w:before="120" w:after="60" w:line="360" w:lineRule="auto"/>
+        <w:jc w:val="left"/>
+        <w:rPr>
+          <w:rFonts w:ascii="Times New Roman" w:hAnsi="Times New Roman" w:eastAsia="Times New Roman" w:cs="Times New Roman"/>
           <w:b/>
           <w:bCs/>
+          <w:color w:val="000000"/>
           <w:sz w:val="24"/>
           <w:szCs w:val="24"/>
         </w:rPr>
       </w:pPr>
       <w:r>
         <w:rPr>
-          <w:rFonts w:ascii="Times New Roman" w:eastAsia="Times New Roman" w:hAnsi="Times New Roman" w:cs="Times New Roman"/>
+          <w:rFonts w:ascii="Times New Roman" w:hAnsi="Times New Roman" w:eastAsia="Times New Roman" w:cs="Times New Roman"/>
           <w:b/>
           <w:bCs/>
+          <w:color w:val="000000"/>
           <w:sz w:val="24"/>
           <w:szCs w:val="24"/>
         </w:rPr>
@@ -11592,18 +11680,25 @@
     <w:p>
       <w:pPr>
         <w:pStyle w:val="Heading2"/>
-        <w:rPr>
+        <w:spacing w:before="120" w:after="60" w:line="360" w:lineRule="auto"/>
+        <w:jc w:val="left"/>
+        <w:rPr>
+          <w:rFonts w:ascii="Times New Roman" w:hAnsi="Times New Roman" w:eastAsia="Times New Roman" w:cs="Times New Roman"/>
           <w:b/>
           <w:bCs/>
+          <w:color w:val="000000"/>
           <w:sz w:val="24"/>
           <w:szCs w:val="24"/>
         </w:rPr>
       </w:pPr>
       <w:r>
         <w:rPr>
-          <w:rFonts w:ascii="Times New Roman" w:hAnsi="Times New Roman"/>
+          <w:rFonts w:ascii="Times New Roman" w:hAnsi="Times New Roman" w:eastAsia="Times New Roman" w:cs="Times New Roman"/>
+          <w:b/>
+          <w:bCs/>
           <w:color w:val="000000"/>
           <w:sz w:val="24"/>
+          <w:szCs w:val="24"/>
         </w:rPr>
         <w:t>3.3 Sensor consistency, ecological context and historical model diagnostics</w:t>
       </w:r>
@@ -11627,6 +11722,14 @@
           <w:sz w:val="22"/>
         </w:rPr>
         <w:t xml:space="preserve">S16). </w:t>
+      </w:r>
+      <w:r>
+        <w:rPr>
+          <w:rFonts w:ascii="Times New Roman" w:hAnsi="Times New Roman"/>
+          <w:color w:val="000000"/>
+          <w:sz w:val="22"/>
+        </w:rPr>
+        <w:t xml:space="preserve">In the targeted comparisons, no monthly P75 comparison above 3500 m met the shared-support rules (0/24): in 15 cases one sensor had fewer than two scenes in the month, and in the other 9 no pixel kept two clear observations from both sensors after cloud, shadow and snow screening. Three October near-time scene pairs at 3514 m qualified, with differences of +0.072 (L7 minus L5, 2001), +0.099 (L8 minus L7, 2014) and -0.044 NDVI (L9 minus L8, 2022) and spatial correlations of 0.86-0.95; none qualified at the 4370 m chip. Their signs match the overall near-time means, but three pairs from one site and month cannot establish sensor consistency above 3500 m (Table S37). </w:t>
       </w:r>
       <w:r>
         <w:rPr>
@@ -11741,11 +11844,17 @@
     <w:p>
       <w:pPr>
         <w:pStyle w:val="Heading1"/>
-        <w:spacing w:before="0" w:after="0" w:line="360" w:lineRule="auto"/>
-      </w:pPr>
-      <w:r>
-        <w:rPr>
-          <w:rFonts w:eastAsia="Times New Roman" w:cs="Times New Roman"/>
+        <w:spacing w:before="120" w:after="60" w:line="360" w:lineRule="auto"/>
+        <w:jc w:val="left"/>
+      </w:pPr>
+      <w:r>
+        <w:rPr>
+          <w:rFonts w:ascii="Times New Roman" w:hAnsi="Times New Roman" w:eastAsia="Times New Roman" w:cs="Times New Roman"/>
+          <w:b/>
+          <w:bCs/>
+          <w:color w:val="000000"/>
+          <w:sz w:val="24"/>
+          <w:szCs w:val="24"/>
         </w:rPr>
         <w:t>4. Discussion</w:t>
       </w:r>
@@ -11894,21 +12003,25 @@
     <w:p>
       <w:pPr>
         <w:pStyle w:val="Heading2"/>
-        <w:spacing w:before="0" w:after="0" w:line="360" w:lineRule="auto"/>
-        <w:rPr>
+        <w:spacing w:before="120" w:after="60" w:line="360" w:lineRule="auto"/>
+        <w:jc w:val="left"/>
+        <w:rPr>
+          <w:rFonts w:ascii="Times New Roman" w:hAnsi="Times New Roman" w:eastAsia="Times New Roman" w:cs="Times New Roman"/>
           <w:b/>
           <w:bCs/>
-          <w:sz w:val="28"/>
-          <w:szCs w:val="28"/>
-        </w:rPr>
-      </w:pPr>
-      <w:r>
-        <w:rPr>
-          <w:rFonts w:ascii="Times New Roman" w:eastAsia="Times New Roman" w:hAnsi="Times New Roman" w:cs="Times New Roman"/>
+          <w:color w:val="000000"/>
+          <w:sz w:val="24"/>
+          <w:szCs w:val="24"/>
+        </w:rPr>
+      </w:pPr>
+      <w:r>
+        <w:rPr>
+          <w:rFonts w:ascii="Times New Roman" w:hAnsi="Times New Roman" w:eastAsia="Times New Roman" w:cs="Times New Roman"/>
           <w:b/>
           <w:bCs/>
-          <w:sz w:val="28"/>
-          <w:szCs w:val="28"/>
+          <w:color w:val="000000"/>
+          <w:sz w:val="24"/>
+          <w:szCs w:val="24"/>
         </w:rPr>
         <w:t>4.1 Hot–dry dominance and the scarcity of hot–wet compounds</w:t>
       </w:r>
@@ -12017,26 +12130,26 @@
     <w:p>
       <w:pPr>
         <w:pStyle w:val="Heading2"/>
-        <w:spacing w:after="0" w:line="360" w:lineRule="auto"/>
+        <w:spacing w:before="120" w:after="60" w:line="360" w:lineRule="auto"/>
         <w:jc w:val="left"/>
         <w:rPr>
-          <w:rFonts w:eastAsia="Times New Roman" w:cs="Times New Roman"/>
+          <w:rFonts w:ascii="Times New Roman" w:hAnsi="Times New Roman" w:eastAsia="Times New Roman" w:cs="Times New Roman"/>
           <w:b/>
           <w:bCs/>
-          <w:kern w:val="0"/>
-          <w:sz w:val="27"/>
-          <w:szCs w:val="27"/>
+          <w:color w:val="000000"/>
+          <w:sz w:val="24"/>
+          <w:szCs w:val="24"/>
           <w14:ligatures w14:val="none"/>
         </w:rPr>
       </w:pPr>
       <w:r>
         <w:rPr>
-          <w:rFonts w:ascii="Times New Roman" w:eastAsia="Times New Roman" w:hAnsi="Times New Roman" w:cs="Times New Roman"/>
+          <w:rFonts w:ascii="Times New Roman" w:hAnsi="Times New Roman" w:eastAsia="Times New Roman" w:cs="Times New Roman"/>
           <w:b/>
           <w:bCs/>
-          <w:kern w:val="0"/>
-          <w:sz w:val="27"/>
-          <w:szCs w:val="27"/>
+          <w:color w:val="000000"/>
+          <w:sz w:val="24"/>
+          <w:szCs w:val="24"/>
           <w14:ligatures w14:val="none"/>
         </w:rPr>
         <w:t>4.2 Seasonally conditioned anomalies and the role of timing</w:t>
@@ -12113,50 +12226,50 @@
     <w:p>
       <w:pPr>
         <w:pStyle w:val="Heading2"/>
-        <w:spacing w:after="0" w:line="360" w:lineRule="auto"/>
+        <w:spacing w:before="120" w:after="60" w:line="360" w:lineRule="auto"/>
         <w:jc w:val="left"/>
         <w:rPr>
-          <w:rFonts w:eastAsia="Times New Roman" w:cs="Times New Roman"/>
+          <w:rFonts w:ascii="Times New Roman" w:hAnsi="Times New Roman" w:eastAsia="Times New Roman" w:cs="Times New Roman"/>
           <w:b/>
           <w:bCs/>
-          <w:kern w:val="0"/>
-          <w:sz w:val="27"/>
-          <w:szCs w:val="27"/>
+          <w:color w:val="000000"/>
+          <w:sz w:val="24"/>
+          <w:szCs w:val="24"/>
           <w14:ligatures w14:val="none"/>
         </w:rPr>
       </w:pPr>
       <w:r>
         <w:rPr>
-          <w:rFonts w:ascii="Times New Roman" w:eastAsia="Times New Roman" w:hAnsi="Times New Roman" w:cs="Times New Roman"/>
+          <w:rFonts w:ascii="Times New Roman" w:hAnsi="Times New Roman" w:eastAsia="Times New Roman" w:cs="Times New Roman"/>
           <w:b/>
           <w:bCs/>
-          <w:kern w:val="0"/>
-          <w:sz w:val="27"/>
-          <w:szCs w:val="27"/>
+          <w:color w:val="000000"/>
+          <w:sz w:val="24"/>
+          <w:szCs w:val="24"/>
           <w14:ligatures w14:val="none"/>
         </w:rPr>
         <w:t xml:space="preserve">4.3 Resistance </w:t>
       </w:r>
       <w:r>
         <w:rPr>
-          <w:rFonts w:ascii="Times New Roman" w:eastAsia="Times New Roman" w:hAnsi="Times New Roman" w:cs="Times New Roman"/>
+          <w:rFonts w:ascii="Times New Roman" w:hAnsi="Times New Roman" w:eastAsia="Times New Roman" w:cs="Times New Roman"/>
           <w:b/>
           <w:bCs/>
-          <w:kern w:val="0"/>
-          <w:sz w:val="27"/>
-          <w:szCs w:val="27"/>
+          <w:color w:val="000000"/>
+          <w:sz w:val="24"/>
+          <w:szCs w:val="24"/>
           <w14:ligatures w14:val="none"/>
         </w:rPr>
         <w:t xml:space="preserve">proxy </w:t>
       </w:r>
       <w:r>
         <w:rPr>
-          <w:rFonts w:ascii="Times New Roman" w:eastAsia="Times New Roman" w:hAnsi="Times New Roman" w:cs="Times New Roman"/>
+          <w:rFonts w:ascii="Times New Roman" w:hAnsi="Times New Roman" w:eastAsia="Times New Roman" w:cs="Times New Roman"/>
           <w:b/>
           <w:bCs/>
-          <w:kern w:val="0"/>
-          <w:sz w:val="27"/>
-          <w:szCs w:val="27"/>
+          <w:color w:val="000000"/>
+          <w:sz w:val="24"/>
+          <w:szCs w:val="24"/>
           <w14:ligatures w14:val="none"/>
         </w:rPr>
         <w:t>and recovery as complementary dimensions of vulnerability</w:t>
@@ -12340,24 +12453,26 @@
       <w:pPr>
         <w:pStyle w:val="Heading2"/>
         <w:keepNext/>
-        <w:spacing w:after="0" w:line="360" w:lineRule="auto"/>
+        <w:spacing w:before="120" w:after="60" w:line="360" w:lineRule="auto"/>
         <w:jc w:val="left"/>
         <w:rPr>
-          <w:rFonts w:eastAsia="Times New Roman" w:cs="Times New Roman"/>
+          <w:rFonts w:ascii="Times New Roman" w:hAnsi="Times New Roman" w:eastAsia="Times New Roman" w:cs="Times New Roman"/>
           <w:b/>
           <w:bCs/>
-          <w:kern w:val="0"/>
-          <w:sz w:val="27"/>
-          <w:szCs w:val="27"/>
+          <w:color w:val="000000"/>
+          <w:sz w:val="24"/>
+          <w:szCs w:val="24"/>
           <w14:ligatures w14:val="none"/>
         </w:rPr>
       </w:pPr>
       <w:r>
         <w:rPr>
-          <w:rFonts w:ascii="Times New Roman" w:hAnsi="Times New Roman"/>
+          <w:rFonts w:ascii="Times New Roman" w:hAnsi="Times New Roman" w:eastAsia="Times New Roman" w:cs="Times New Roman"/>
           <w:b/>
+          <w:bCs/>
           <w:color w:val="000000"/>
           <w:sz w:val="24"/>
+          <w:szCs w:val="24"/>
         </w:rPr>
         <w:t>4.4 Elevation associations, land cover, irrigation and seasonal coverage</w:t>
       </w:r>
@@ -12873,20 +12988,25 @@
       <w:pPr>
         <w:pStyle w:val="Heading2"/>
         <w:keepNext/>
-        <w:spacing w:before="0" w:after="0" w:line="360" w:lineRule="auto"/>
-        <w:rPr>
+        <w:spacing w:before="120" w:after="60" w:line="360" w:lineRule="auto"/>
+        <w:jc w:val="left"/>
+        <w:rPr>
+          <w:rFonts w:ascii="Times New Roman" w:hAnsi="Times New Roman" w:eastAsia="Times New Roman" w:cs="Times New Roman"/>
           <w:b/>
           <w:bCs/>
+          <w:color w:val="000000"/>
           <w:sz w:val="24"/>
           <w:szCs w:val="24"/>
         </w:rPr>
       </w:pPr>
       <w:r>
         <w:rPr>
-          <w:rFonts w:ascii="Times New Roman" w:hAnsi="Times New Roman"/>
+          <w:rFonts w:ascii="Times New Roman" w:hAnsi="Times New Roman" w:eastAsia="Times New Roman" w:cs="Times New Roman"/>
           <w:b/>
+          <w:bCs/>
           <w:color w:val="000000"/>
           <w:sz w:val="24"/>
+          <w:szCs w:val="24"/>
         </w:rPr>
         <w:t>4.5 Descriptive compound-versus-single-event contrasts</w:t>
       </w:r>
@@ -13049,20 +13169,25 @@
       <w:pPr>
         <w:pStyle w:val="Heading2"/>
         <w:keepNext/>
-        <w:spacing w:before="0" w:after="0" w:line="360" w:lineRule="auto"/>
-        <w:rPr>
+        <w:spacing w:before="120" w:after="60" w:line="360" w:lineRule="auto"/>
+        <w:jc w:val="left"/>
+        <w:rPr>
+          <w:rFonts w:ascii="Times New Roman" w:hAnsi="Times New Roman" w:eastAsia="Times New Roman" w:cs="Times New Roman"/>
           <w:b/>
           <w:bCs/>
+          <w:color w:val="000000"/>
           <w:sz w:val="24"/>
           <w:szCs w:val="24"/>
         </w:rPr>
       </w:pPr>
       <w:r>
         <w:rPr>
-          <w:rFonts w:ascii="Times New Roman" w:hAnsi="Times New Roman"/>
+          <w:rFonts w:ascii="Times New Roman" w:hAnsi="Times New Roman" w:eastAsia="Times New Roman" w:cs="Times New Roman"/>
           <w:b/>
+          <w:bCs/>
           <w:color w:val="000000"/>
           <w:sz w:val="24"/>
+          <w:szCs w:val="24"/>
         </w:rPr>
         <w:t>4.6 Historical model associations and temporal transfer</w:t>
       </w:r>
@@ -13295,17 +13420,25 @@
       <w:pPr>
         <w:pStyle w:val="Heading2"/>
         <w:keepNext/>
-        <w:spacing w:after="120" w:line="360" w:lineRule="auto"/>
-        <w:rPr>
+        <w:spacing w:before="120" w:after="60" w:line="360" w:lineRule="auto"/>
+        <w:jc w:val="left"/>
+        <w:rPr>
+          <w:rFonts w:ascii="Times New Roman" w:hAnsi="Times New Roman" w:eastAsia="Times New Roman" w:cs="Times New Roman"/>
           <w:b/>
-        </w:rPr>
-      </w:pPr>
-      <w:r>
-        <w:rPr>
-          <w:rFonts w:ascii="Times New Roman" w:hAnsi="Times New Roman"/>
+          <w:bCs/>
+          <w:color w:val="000000"/>
+          <w:sz w:val="24"/>
+          <w:szCs w:val="24"/>
+        </w:rPr>
+      </w:pPr>
+      <w:r>
+        <w:rPr>
+          <w:rFonts w:ascii="Times New Roman" w:hAnsi="Times New Roman" w:eastAsia="Times New Roman" w:cs="Times New Roman"/>
           <w:b/>
-          <w:color w:val="000000"/>
-          <w:sz w:val="22"/>
+          <w:bCs/>
+          <w:color w:val="000000"/>
+          <w:sz w:val="24"/>
+          <w:szCs w:val="24"/>
         </w:rPr>
         <w:t>4.7 Limitations and implications</w:t>
       </w:r>
@@ -13632,6 +13765,14 @@
           <w:color w:val="000000"/>
           <w:sz w:val="22"/>
         </w:rPr>
+        <w:t xml:space="preserve">Cross-sensor consistency could not be verified above 3500 m, where scene scarcity and snow and cloud screening left no assessable monthly comparison; estimates in this belt are therefore lower-confidence and are interpreted with their harmonization and detrending sensitivities (Table S34). A dedicated high-elevation validation using all overlapping snow-free acquisitions remains needed. </w:t>
+      </w:r>
+      <w:r>
+        <w:rPr>
+          <w:rFonts w:ascii="Times New Roman" w:hAnsi="Times New Roman"/>
+          <w:color w:val="000000"/>
+          <w:sz w:val="22"/>
+        </w:rPr>
         <w:t xml:space="preserve">Mixing irrigated croplands, rainfed systems, forests </w:t>
       </w:r>
       <w:r>
@@ -14034,79 +14175,7 @@
           <w:color w:val="000000"/>
           <w:sz w:val="22"/>
         </w:rPr>
-        <w:t xml:space="preserve">P75 </w:t>
-      </w:r>
-      <w:r>
-        <w:rPr>
-          <w:rFonts w:ascii="Times New Roman" w:hAnsi="Times New Roman"/>
-          <w:color w:val="000000"/>
-          <w:sz w:val="22"/>
-        </w:rPr>
-        <w:t xml:space="preserve">can mask short </w:t>
-      </w:r>
-      <w:r>
-        <w:rPr>
-          <w:rFonts w:ascii="Times New Roman" w:hAnsi="Times New Roman"/>
-          <w:color w:val="000000"/>
-          <w:sz w:val="22"/>
-        </w:rPr>
-        <w:t xml:space="preserve">declines, but raw P75–P50 </w:t>
-      </w:r>
-      <w:r>
-        <w:rPr>
-          <w:rFonts w:ascii="Times New Roman" w:hAnsi="Times New Roman"/>
-          <w:color w:val="000000"/>
-          <w:sz w:val="22"/>
-        </w:rPr>
-        <w:t xml:space="preserve">offsets </w:t>
-      </w:r>
-      <w:r>
-        <w:rPr>
-          <w:rFonts w:ascii="Times New Roman" w:hAnsi="Times New Roman"/>
-          <w:color w:val="000000"/>
-          <w:sz w:val="22"/>
-        </w:rPr>
-        <w:t xml:space="preserve">cannot </w:t>
-      </w:r>
-      <w:r>
-        <w:rPr>
-          <w:rFonts w:ascii="Times New Roman" w:hAnsi="Times New Roman"/>
-          <w:color w:val="000000"/>
-          <w:sz w:val="22"/>
-        </w:rPr>
-        <w:t xml:space="preserve">directly </w:t>
-      </w:r>
-      <w:r>
-        <w:rPr>
-          <w:rFonts w:ascii="Times New Roman" w:hAnsi="Times New Roman"/>
-          <w:color w:val="000000"/>
-          <w:sz w:val="22"/>
-        </w:rPr>
-        <w:t xml:space="preserve">quantify standardized resistance-proxy </w:t>
-      </w:r>
-      <w:r>
-        <w:rPr>
-          <w:rFonts w:ascii="Times New Roman" w:hAnsi="Times New Roman"/>
-          <w:color w:val="000000"/>
-          <w:sz w:val="22"/>
-        </w:rPr>
-        <w:t xml:space="preserve">or recovery-month bias: </w:t>
-      </w:r>
-      <w:r>
-        <w:rPr>
-          <w:rFonts w:ascii="Times New Roman" w:hAnsi="Times New Roman"/>
-          <w:color w:val="000000"/>
-          <w:sz w:val="22"/>
-        </w:rPr>
-        <w:t xml:space="preserve">seasonal references and subsequent trajectories </w:t>
-      </w:r>
-      <w:r>
-        <w:rPr>
-          <w:rFonts w:ascii="Times New Roman" w:hAnsi="Times New Roman"/>
-          <w:color w:val="000000"/>
-          <w:sz w:val="22"/>
-        </w:rPr>
-        <w:t>also matter (Table S39).</w:t>
+        <w:t xml:space="preserve">P75 can mask short declines. Because event months and their calendar-month references are both P75 composites, a stable P75–P50 offset largely cancels in the standardized anomaly; only changes in the offset during events affect the resistance proxy and recovery. Year-to-year changes in belt-mean offsets (0.0037-0.0096 NDVI; Table S39) are smaller than the interannual NDVI standard deviations of the diagnostic strata (0.015-0.070; Table S30), although low-variance desert cover is most sensitive and cell- and event-level offsets may be larger. By favouring greener observations, P75 is expected to understate suppression and resistance proxy magnitudes and to favour earlier detected greenness return; the reported suppression is therefore likely conservative and the six-month recovery probability an upper estimate. Recomputing resistance and recovery from P50 composites remains future work.</w:t>
       </w:r>
     </w:p>
     <w:p>
@@ -14328,14 +14397,25 @@
     <w:p>
       <w:pPr>
         <w:pStyle w:val="Heading1"/>
-        <w:spacing w:before="0" w:after="0" w:line="360" w:lineRule="auto"/>
-        <w:rPr>
-          <w:color w:val="auto"/>
-        </w:rPr>
-      </w:pPr>
-      <w:r>
-        <w:rPr>
-          <w:rFonts w:eastAsia="Times New Roman" w:cs="Times New Roman"/>
+        <w:spacing w:before="120" w:after="60" w:line="360" w:lineRule="auto"/>
+        <w:jc w:val="left"/>
+        <w:rPr>
+          <w:rFonts w:ascii="Times New Roman" w:hAnsi="Times New Roman" w:eastAsia="Times New Roman" w:cs="Times New Roman"/>
+          <w:b/>
+          <w:bCs/>
+          <w:color w:val="000000"/>
+          <w:sz w:val="24"/>
+          <w:szCs w:val="24"/>
+        </w:rPr>
+      </w:pPr>
+      <w:r>
+        <w:rPr>
+          <w:rFonts w:ascii="Times New Roman" w:hAnsi="Times New Roman" w:eastAsia="Times New Roman" w:cs="Times New Roman"/>
+          <w:b/>
+          <w:bCs/>
+          <w:color w:val="000000"/>
+          <w:sz w:val="24"/>
+          <w:szCs w:val="24"/>
         </w:rPr>
         <w:t>5. Conclusion</w:t>
       </w:r>
@@ -14610,18 +14690,22 @@
       <w:pPr>
         <w:spacing w:after="0" w:line="276" w:lineRule="auto"/>
         <w:rPr>
-          <w:rFonts w:eastAsia="等线"/>
+          <w:rFonts w:ascii="Times New Roman" w:hAnsi="Times New Roman" w:eastAsia="Times New Roman" w:cs="Times New Roman"/>
           <w:b/>
           <w:bCs/>
-          <w:color w:val="auto"/>
-        </w:rPr>
-      </w:pPr>
-      <w:r>
-        <w:rPr>
-          <w:rFonts w:eastAsia="等线"/>
+          <w:color w:val="000000"/>
+          <w:sz w:val="24"/>
+          <w:szCs w:val="24"/>
+        </w:rPr>
+      </w:pPr>
+      <w:r>
+        <w:rPr>
+          <w:rFonts w:ascii="Times New Roman" w:hAnsi="Times New Roman" w:eastAsia="Times New Roman" w:cs="Times New Roman"/>
           <w:b/>
           <w:bCs/>
-          <w:color w:val="auto"/>
+          <w:color w:val="000000"/>
+          <w:sz w:val="24"/>
+          <w:szCs w:val="24"/>
         </w:rPr>
         <w:lastRenderedPageBreak/>
         <w:t>Authorship contribution statement</w:t>
@@ -14793,18 +14877,22 @@
       <w:pPr>
         <w:spacing w:after="0" w:line="276" w:lineRule="auto"/>
         <w:rPr>
-          <w:rFonts w:eastAsiaTheme="minorEastAsia"/>
+          <w:rFonts w:ascii="Times New Roman" w:hAnsi="Times New Roman" w:eastAsia="Times New Roman" w:cs="Times New Roman"/>
           <w:b/>
           <w:bCs/>
-          <w:color w:val="000000" w:themeColor="text1"/>
-        </w:rPr>
-      </w:pPr>
-      <w:r>
-        <w:rPr>
-          <w:rFonts w:eastAsiaTheme="minorEastAsia"/>
+          <w:color w:val="000000"/>
+          <w:sz w:val="24"/>
+          <w:szCs w:val="24"/>
+        </w:rPr>
+      </w:pPr>
+      <w:r>
+        <w:rPr>
+          <w:rFonts w:ascii="Times New Roman" w:hAnsi="Times New Roman" w:eastAsia="Times New Roman" w:cs="Times New Roman"/>
           <w:b/>
           <w:bCs/>
-          <w:color w:val="000000" w:themeColor="text1"/>
+          <w:color w:val="000000"/>
+          <w:sz w:val="24"/>
+          <w:szCs w:val="24"/>
         </w:rPr>
         <w:t xml:space="preserve">Declaration of competing interest </w:t>
       </w:r>
@@ -14841,18 +14929,22 @@
       <w:pPr>
         <w:spacing w:after="0" w:line="276" w:lineRule="auto"/>
         <w:rPr>
-          <w:rFonts w:eastAsiaTheme="minorEastAsia"/>
+          <w:rFonts w:ascii="Times New Roman" w:hAnsi="Times New Roman" w:eastAsia="Times New Roman" w:cs="Times New Roman"/>
           <w:b/>
           <w:bCs/>
-          <w:color w:val="000000" w:themeColor="text1"/>
-        </w:rPr>
-      </w:pPr>
-      <w:r>
-        <w:rPr>
-          <w:rFonts w:eastAsiaTheme="minorEastAsia"/>
+          <w:color w:val="000000"/>
+          <w:sz w:val="24"/>
+          <w:szCs w:val="24"/>
+        </w:rPr>
+      </w:pPr>
+      <w:r>
+        <w:rPr>
+          <w:rFonts w:ascii="Times New Roman" w:hAnsi="Times New Roman" w:eastAsia="Times New Roman" w:cs="Times New Roman"/>
           <w:b/>
           <w:bCs/>
-          <w:color w:val="000000" w:themeColor="text1"/>
+          <w:color w:val="000000"/>
+          <w:sz w:val="24"/>
+          <w:szCs w:val="24"/>
         </w:rPr>
         <w:t>Data availability</w:t>
       </w:r>
@@ -14922,8 +15014,32 @@
       <w:pPr>
         <w:spacing w:after="0" w:line="276" w:lineRule="auto"/>
         <w:rPr>
+          <w:rFonts w:ascii="Times New Roman" w:hAnsi="Times New Roman" w:eastAsia="Times New Roman" w:cs="Times New Roman"/>
           <w:b/>
           <w:bCs/>
+          <w:color w:val="000000"/>
+          <w:sz w:val="24"/>
+          <w:szCs w:val="24"/>
+          <w14:ligatures w14:val="none"/>
+        </w:rPr>
+      </w:pPr>
+      <w:r>
+        <w:rPr>
+          <w:rFonts w:ascii="Times New Roman" w:hAnsi="Times New Roman" w:eastAsia="Times New Roman" w:cs="Times New Roman"/>
+          <w:b/>
+          <w:bCs/>
+          <w:color w:val="000000"/>
+          <w:sz w:val="24"/>
+          <w:szCs w:val="24"/>
+          <w14:ligatures w14:val="none"/>
+        </w:rPr>
+        <w:t>Acknowledgements</w:t>
+      </w:r>
+    </w:p>
+    <w:p>
+      <w:pPr>
+        <w:spacing w:after="0" w:line="276" w:lineRule="auto"/>
+        <w:rPr>
           <w:color w:val="auto"/>
           <w:kern w:val="0"/>
           <w14:ligatures w14:val="none"/>
@@ -14931,13 +15047,11 @@
       </w:pPr>
       <w:r>
         <w:rPr>
-          <w:b/>
-          <w:bCs/>
           <w:color w:val="auto"/>
           <w:kern w:val="0"/>
           <w14:ligatures w14:val="none"/>
         </w:rPr>
-        <w:t>Acknowledgements</w:t>
+        <w:t>The authors gratefully acknowledge the support of the National Natural Science Foundation of China, the National Key Research and Development Program of China, and the Strategic Priority Research Program of the Chinese Academy of Sciences in carrying out this work.</w:t>
       </w:r>
     </w:p>
     <w:p>
@@ -14949,80 +15063,66 @@
           <w14:ligatures w14:val="none"/>
         </w:rPr>
       </w:pPr>
-      <w:r>
+    </w:p>
+    <w:p>
+      <w:pPr>
+        <w:spacing w:after="0" w:line="276" w:lineRule="auto"/>
+        <w:rPr>
+          <w:rFonts w:ascii="Times New Roman" w:hAnsi="Times New Roman" w:eastAsia="Times New Roman" w:cs="Times New Roman"/>
+          <w:b/>
+          <w:bCs/>
+          <w:color w:val="000000"/>
+          <w:sz w:val="24"/>
+          <w:szCs w:val="24"/>
+          <w14:ligatures w14:val="none"/>
+        </w:rPr>
+      </w:pPr>
+      <w:r>
+        <w:rPr>
+          <w:rFonts w:ascii="Times New Roman" w:hAnsi="Times New Roman" w:eastAsia="Times New Roman" w:cs="Times New Roman"/>
+          <w:b/>
+          <w:bCs/>
+          <w:color w:val="000000"/>
+          <w:sz w:val="24"/>
+          <w:szCs w:val="24"/>
+          <w14:ligatures w14:val="none"/>
+        </w:rPr>
+        <w:t>Funding</w:t>
+      </w:r>
+    </w:p>
+    <w:p>
+      <w:pPr>
+        <w:spacing w:after="0" w:line="276" w:lineRule="auto"/>
         <w:rPr>
           <w:color w:val="auto"/>
           <w:kern w:val="0"/>
           <w14:ligatures w14:val="none"/>
         </w:rPr>
-        <w:t>The authors gratefully acknowledge the support of the National Natural Science Foundation of China, the National Key Research and Development Program of China, and the Strategic Priority Research Program of the Chinese Academy of Sciences in carrying out this work.</w:t>
-      </w:r>
-    </w:p>
-    <w:p>
-      <w:pPr>
-        <w:spacing w:after="0" w:line="276" w:lineRule="auto"/>
+      </w:pPr>
+      <w:r>
         <w:rPr>
           <w:color w:val="auto"/>
           <w:kern w:val="0"/>
           <w14:ligatures w14:val="none"/>
         </w:rPr>
-      </w:pPr>
-    </w:p>
-    <w:p>
-      <w:pPr>
-        <w:spacing w:after="0" w:line="276" w:lineRule="auto"/>
-        <w:rPr>
-          <w:b/>
-          <w:bCs/>
+        <w:t xml:space="preserve">This work was supported by the National Natural Science Foundation of China (42330707), The National Key Research and Development Program of China (2024YFD1700904), the Science Fund for Creative Research Groups of the National Natural Science Foundation of China (72221002), </w:t>
+      </w:r>
+      <w:bookmarkStart w:id="0" w:name="_Hlk227247038"/>
+      <w:r>
+        <w:rPr>
           <w:color w:val="auto"/>
           <w:kern w:val="0"/>
           <w14:ligatures w14:val="none"/>
         </w:rPr>
-      </w:pPr>
-      <w:r>
-        <w:rPr>
-          <w:b/>
-          <w:bCs/>
+        <w:t>the Strategic Priority Research Program of the Chinese Academy of Sciences (XDB0740100)</w:t>
+      </w:r>
+      <w:bookmarkEnd w:id="0"/>
+      <w:r>
+        <w:rPr>
           <w:color w:val="auto"/>
           <w:kern w:val="0"/>
           <w14:ligatures w14:val="none"/>
         </w:rPr>
-        <w:t>Funding</w:t>
-      </w:r>
-    </w:p>
-    <w:p>
-      <w:pPr>
-        <w:spacing w:after="0" w:line="276" w:lineRule="auto"/>
-        <w:rPr>
-          <w:color w:val="auto"/>
-          <w:kern w:val="0"/>
-          <w14:ligatures w14:val="none"/>
-        </w:rPr>
-      </w:pPr>
-      <w:r>
-        <w:rPr>
-          <w:color w:val="auto"/>
-          <w:kern w:val="0"/>
-          <w14:ligatures w14:val="none"/>
-        </w:rPr>
-        <w:t xml:space="preserve">This work was supported by the National Natural Science Foundation of China (42330707), The National Key Research and Development Program of China (2024YFD1700904), the Science Fund for Creative Research Groups of the National Natural Science Foundation of China (72221002), </w:t>
-      </w:r>
-      <w:bookmarkStart w:id="0" w:name="_Hlk227247038"/>
-      <w:r>
-        <w:rPr>
-          <w:color w:val="auto"/>
-          <w:kern w:val="0"/>
-          <w14:ligatures w14:val="none"/>
-        </w:rPr>
-        <w:t>the Strategic Priority Research Program of the Chinese Academy of Sciences (XDB0740100)</w:t>
-      </w:r>
-      <w:bookmarkEnd w:id="0"/>
-      <w:r>
-        <w:rPr>
-          <w:color w:val="auto"/>
-          <w:kern w:val="0"/>
-          <w14:ligatures w14:val="none"/>
-        </w:rPr>
         <w:t>.</w:t>
       </w:r>
     </w:p>
@@ -15036,14 +15136,26 @@
     <w:p>
       <w:pPr>
         <w:pStyle w:val="Heading1"/>
-        <w:spacing w:before="0" w:after="0" w:line="360" w:lineRule="auto"/>
-        <w:rPr>
+        <w:spacing w:before="120" w:after="60" w:line="360" w:lineRule="auto"/>
+        <w:jc w:val="left"/>
+        <w:rPr>
+          <w:rFonts w:ascii="Times New Roman" w:hAnsi="Times New Roman" w:eastAsia="Times New Roman" w:cs="Times New Roman"/>
+          <w:b/>
+          <w:bCs/>
+          <w:color w:val="000000"/>
+          <w:sz w:val="24"/>
+          <w:szCs w:val="24"/>
           <w:lang w:val="pt-PT"/>
         </w:rPr>
       </w:pPr>
       <w:r>
         <w:rPr>
-          <w:rFonts w:eastAsia="Times New Roman" w:cs="Times New Roman"/>
+          <w:rFonts w:ascii="Times New Roman" w:hAnsi="Times New Roman" w:eastAsia="Times New Roman" w:cs="Times New Roman"/>
+          <w:b/>
+          <w:bCs/>
+          <w:color w:val="000000"/>
+          <w:sz w:val="24"/>
+          <w:szCs w:val="24"/>
           <w:lang w:val="pt-PT"/>
         </w:rPr>
         <w:lastRenderedPageBreak/>
@@ -15273,15 +15385,15 @@
       </w:r>
       <w:r>
         <w:rPr>
+          <w:i/>
           <w:lang w:val="it-IT"/>
-          <w:i/>
         </w:rPr>
         <w:t>25</w:t>
       </w:r>
       <w:r>
         <w:rPr>
+          <w:i w:val="0"/>
           <w:lang w:val="it-IT"/>
-          <w:i w:val="0"/>
         </w:rPr>
         <w:t xml:space="preserve">(19), 3897-3912. </w:t>
       </w:r>
@@ -16066,8 +16178,8 @@
       </w:r>
       <w:r>
         <w:rPr>
+          <w:i/>
           <w:lang w:val="de-CH"/>
-          <w:i/>
         </w:rPr>
         <w:t xml:space="preserve">The </w:t>
       </w:r>
@@ -16098,15 +16210,15 @@
       </w:r>
       <w:r>
         <w:rPr>
+          <w:i/>
           <w:lang w:val="de-CH"/>
-          <w:i/>
         </w:rPr>
         <w:t>689</w:t>
       </w:r>
       <w:r>
         <w:rPr>
+          <w:i w:val="0"/>
           <w:lang w:val="de-CH"/>
-          <w:i w:val="0"/>
         </w:rPr>
         <w:t xml:space="preserve">, 1228-1234. </w:t>
       </w:r>
@@ -16160,8 +16272,8 @@
       </w:r>
       <w:r>
         <w:rPr>
+          <w:i/>
           <w:lang w:val="it-IT"/>
-          <w:i/>
         </w:rPr>
         <w:t xml:space="preserve">The </w:t>
       </w:r>
@@ -16192,15 +16304,15 @@
       </w:r>
       <w:r>
         <w:rPr>
+          <w:i/>
           <w:lang w:val="it-IT"/>
-          <w:i/>
         </w:rPr>
         <w:t>816</w:t>
       </w:r>
       <w:r>
         <w:rPr>
+          <w:i w:val="0"/>
           <w:lang w:val="it-IT"/>
-          <w:i w:val="0"/>
         </w:rPr>
         <w:t xml:space="preserve">, 151604. </w:t>
       </w:r>
@@ -16362,15 +16474,15 @@
       </w:r>
       <w:r>
         <w:rPr>
+          <w:i/>
           <w:lang w:val="it-IT"/>
-          <w:i/>
         </w:rPr>
         <w:t>223</w:t>
       </w:r>
       <w:r>
         <w:rPr>
+          <w:i w:val="0"/>
           <w:lang w:val="it-IT"/>
-          <w:i w:val="0"/>
         </w:rPr>
         <w:t xml:space="preserve">, 119990. </w:t>
       </w:r>
@@ -16728,15 +16840,15 @@
       </w:r>
       <w:r>
         <w:rPr>
+          <w:i/>
           <w:lang w:val="it-IT"/>
-          <w:i/>
         </w:rPr>
         <w:t>96</w:t>
       </w:r>
       <w:r>
         <w:rPr>
+          <w:i w:val="0"/>
           <w:lang w:val="it-IT"/>
-          <w:i w:val="0"/>
         </w:rPr>
         <w:t xml:space="preserve">(1-2), 185-201. </w:t>
       </w:r>
@@ -16825,60 +16937,60 @@
       </w:r>
       <w:r>
         <w:rPr>
+          <w:i w:val="0"/>
           <w:lang w:val="pt-PT"/>
+        </w:rPr>
+        <w:t xml:space="preserve">Global, 0.05-Degree Product </w:t>
+      </w:r>
+      <w:r>
+        <w:rPr>
           <w:i w:val="0"/>
         </w:rPr>
-        <w:t xml:space="preserve">Global, 0.05-Degree Product </w:t>
+        <w:t xml:space="preserve">of </w:t>
       </w:r>
       <w:r>
         <w:rPr>
           <w:i w:val="0"/>
-        </w:rPr>
-        <w:t xml:space="preserve">of </w:t>
-      </w:r>
-      <w:r>
-        <w:rPr>
           <w:lang w:val="pt-PT"/>
+        </w:rPr>
+        <w:t xml:space="preserve">Solar-Induced Chlorophyll Fluorescence Derived </w:t>
+      </w:r>
+      <w:r>
+        <w:rPr>
           <w:i w:val="0"/>
         </w:rPr>
-        <w:t xml:space="preserve">Solar-Induced Chlorophyll Fluorescence Derived </w:t>
+        <w:t xml:space="preserve">from OCO-2, MODIS, and </w:t>
       </w:r>
       <w:r>
         <w:rPr>
           <w:i w:val="0"/>
-        </w:rPr>
-        <w:t xml:space="preserve">from OCO-2, MODIS, and </w:t>
-      </w:r>
-      <w:r>
-        <w:rPr>
           <w:lang w:val="pt-PT"/>
+        </w:rPr>
+        <w:t xml:space="preserve">Reanalysis Data. </w:t>
+      </w:r>
+      <w:r/>
+      <w:r>
+        <w:rPr>
+          <w:i/>
+        </w:rPr>
+        <w:t xml:space="preserve">Remote Sensing, </w:t>
+      </w:r>
+      <w:r>
+        <w:rPr>
+          <w:lang w:val="pt-PT"/>
+        </w:rPr>
+      </w:r>
+      <w:r>
+        <w:rPr>
+          <w:i/>
+          <w:lang w:val="pt-PT"/>
+        </w:rPr>
+        <w:t>11</w:t>
+      </w:r>
+      <w:r>
+        <w:rPr>
           <w:i w:val="0"/>
-        </w:rPr>
-        <w:t xml:space="preserve">Reanalysis Data. </w:t>
-      </w:r>
-      <w:r/>
-      <w:r>
-        <w:rPr>
-          <w:i/>
-        </w:rPr>
-        <w:t xml:space="preserve">Remote Sensing, </w:t>
-      </w:r>
-      <w:r>
-        <w:rPr>
           <w:lang w:val="pt-PT"/>
-        </w:rPr>
-      </w:r>
-      <w:r>
-        <w:rPr>
-          <w:lang w:val="pt-PT"/>
-          <w:i/>
-        </w:rPr>
-        <w:t>11</w:t>
-      </w:r>
-      <w:r>
-        <w:rPr>
-          <w:lang w:val="pt-PT"/>
-          <w:i w:val="0"/>
         </w:rPr>
         <w:t>(5), 517. https://doi.org/10.3390/rs11050517</w:t>
       </w:r>
@@ -18285,15 +18397,15 @@
       </w:r>
       <w:r>
         <w:rPr>
+          <w:i/>
           <w:lang w:val="de-CH"/>
-          <w:i/>
         </w:rPr>
         <w:t>631</w:t>
       </w:r>
       <w:r>
         <w:rPr>
+          <w:i w:val="0"/>
           <w:lang w:val="de-CH"/>
-          <w:i w:val="0"/>
         </w:rPr>
         <w:t xml:space="preserve">, 130775. </w:t>
       </w:r>

</xml_diff>

<commit_message>
Restore original manuscript title
</commit_message>
<xml_diff>
--- a/revision_2026_10_18/documents/Manuscript_Clean.docx
+++ b/revision_2026_10_18/documents/Manuscript_Clean.docx
@@ -20,39 +20,7 @@
           <w:color w:val="000000"/>
           <w:sz w:val="28"/>
         </w:rPr>
-        <w:t xml:space="preserve">Compound Heat–Drought Extremes </w:t>
-      </w:r>
-      <w:r>
-        <w:rPr>
-          <w:rFonts w:ascii="Times New Roman" w:hAnsi="Times New Roman"/>
-          <w:color w:val="000000"/>
-          <w:sz w:val="28"/>
-        </w:rPr>
-        <w:t xml:space="preserve">in Pakistan (1985–2025): </w:t>
-      </w:r>
-      <w:r>
-        <w:rPr>
-          <w:rFonts w:ascii="Times New Roman" w:hAnsi="Times New Roman"/>
-          <w:color w:val="000000"/>
-          <w:sz w:val="28"/>
-        </w:rPr>
-        <w:t xml:space="preserve">Separating Climatic Exposure from Observed </w:t>
-      </w:r>
-      <w:r>
-        <w:rPr>
-          <w:rFonts w:ascii="Times New Roman" w:hAnsi="Times New Roman"/>
-          <w:color w:val="000000"/>
-          <w:sz w:val="28"/>
-        </w:rPr>
-        <w:t xml:space="preserve">NDVI </w:t>
-      </w:r>
-      <w:r>
-        <w:rPr>
-          <w:rFonts w:ascii="Times New Roman" w:hAnsi="Times New Roman"/>
-          <w:color w:val="000000"/>
-          <w:sz w:val="28"/>
-        </w:rPr>
-        <w:t>Response</w:t>
+        <w:t>Compound Heat–Drought Extremes and Vegetation Response: Separating Climatic Exposure from Ecosystem Impact — A National Landsat NDVI Assessment for Pakistan (1985–2025)</w:t>
       </w:r>
     </w:p>
     <w:p>

</xml_diff>